<commit_message>
Update CV with two new projects
</commit_message>
<xml_diff>
--- a/documents/chaerin-lee-cv.docx
+++ b/documents/chaerin-lee-cv.docx
@@ -215,7 +215,149 @@
         <w:pStyle w:val="Heading2"/>
       </w:pPr>
       <w:r>
-        <w:t>1. ESG-Driven Regeneration &amp; Business Strategy for Let’s Run Park Seoul</w:t>
+        <w:t>1. Hotel Revenue Management Analytics</w:t>
+      </w:r>
+    </w:p>
+    <w:p>
+      <w:pPr>
+        <w:keepNext/>
+        <w:spacing w:after="20"/>
+      </w:pPr>
+      <w:r>
+        <w:rPr>
+          <w:i/>
+          <w:color w:val="4B4B4B"/>
+        </w:rPr>
+        <w:t>Tourism Revenue Management</w:t>
+      </w:r>
+    </w:p>
+    <w:p>
+      <w:pPr>
+        <w:pStyle w:val="CVBullet"/>
+      </w:pPr>
+      <w:r>
+        <w:rPr>
+          <w:b/>
+        </w:rPr>
+        <w:t xml:space="preserve">• </w:t>
+      </w:r>
+      <w:r>
+        <w:t>Completed weekly Excel-based case analyses involving hotel performance measurement, pricing, demand forecasting, booking curves, overbooking, inventory allocation, group displacement, and distribution-channel management.</w:t>
+      </w:r>
+    </w:p>
+    <w:p>
+      <w:pPr>
+        <w:pStyle w:val="CVBullet"/>
+      </w:pPr>
+      <w:r>
+        <w:rPr>
+          <w:b/>
+        </w:rPr>
+        <w:t xml:space="preserve">• </w:t>
+      </w:r>
+      <w:r>
+        <w:t>Calculated occupancy, ADR, RevPAR, net ADR, and GOPPAR, and evaluated room-upselling and distribution-channel scenarios using incremental revenue, commission, and profitability measures.</w:t>
+      </w:r>
+    </w:p>
+    <w:p>
+      <w:pPr>
+        <w:pStyle w:val="CVBullet"/>
+      </w:pPr>
+      <w:r>
+        <w:rPr>
+          <w:b/>
+        </w:rPr>
+        <w:t xml:space="preserve">• </w:t>
+      </w:r>
+      <w:r>
+        <w:t>Conducted a group displacement analysis incorporating forecast room demand, segment-specific rates, OTA commissions, and ancillary revenues and costs; recommended optional dates projected to generate $16,877 more net revenue and estimated the break-even group rate for the preferred dates.</w:t>
+      </w:r>
+    </w:p>
+    <w:p>
+      <w:pPr>
+        <w:pStyle w:val="Heading2"/>
+      </w:pPr>
+      <w:r>
+        <w:t>2. Tourism Dependence &amp; Economic Impact Analysis: The Maldives</w:t>
+      </w:r>
+    </w:p>
+    <w:p>
+      <w:pPr>
+        <w:keepNext/>
+        <w:spacing w:after="20"/>
+      </w:pPr>
+      <w:r>
+        <w:rPr>
+          <w:i/>
+          <w:color w:val="4B4B4B"/>
+        </w:rPr>
+        <w:t>Tourism Economics</w:t>
+      </w:r>
+    </w:p>
+    <w:p>
+      <w:pPr>
+        <w:pStyle w:val="CVBullet"/>
+      </w:pPr>
+      <w:r>
+        <w:rPr>
+          <w:b/>
+        </w:rPr>
+        <w:t xml:space="preserve">• </w:t>
+      </w:r>
+      <w:r>
+        <w:t>Sourced and structured WTTC data in Excel, covering 2018–2023 historical indicators and 2024 and 2034 projections for tourism GDP, employment, visitor spending, and inbound markets; created comparative visualizations for a team research report.</w:t>
+      </w:r>
+    </w:p>
+    <w:p>
+      <w:pPr>
+        <w:pStyle w:val="CVBullet"/>
+      </w:pPr>
+      <w:r>
+        <w:rPr>
+          <w:b/>
+        </w:rPr>
+        <w:t xml:space="preserve">• </w:t>
+      </w:r>
+      <w:r>
+        <w:t>Benchmarked the Maldives’ 2023 tourism contribution—58.9% of GDP and 76.8% of employment—against global and South Asian averages, and identified that international visitors accounted for 99.4% of total tourism spending.</w:t>
+      </w:r>
+    </w:p>
+    <w:p>
+      <w:pPr>
+        <w:pStyle w:val="CVBullet"/>
+      </w:pPr>
+      <w:r>
+        <w:rPr>
+          <w:b/>
+        </w:rPr>
+        <w:t xml:space="preserve">• </w:t>
+      </w:r>
+      <w:r>
+        <w:t>Applied tourism economics concepts—including demand elasticity, multiplier effects, externalities, public goods, and opportunity cost—to evaluate tourism-led growth, structural dependence, environmental risks, and sustainable policy priorities.</w:t>
+      </w:r>
+    </w:p>
+    <w:p>
+      <w:r>
+        <w:br w:type="page"/>
+      </w:r>
+    </w:p>
+    <w:p>
+      <w:pPr>
+        <w:pStyle w:val="Heading1"/>
+        <w:pBdr>
+          <w:bottom w:val="single" w:sz="8" w:space="1" w:color="0C344E"/>
+        </w:pBdr>
+      </w:pPr>
+      <w:r>
+        <w:t>SELECTED COURSE PROJECTS (CONTINUED)</w:t>
+      </w:r>
+    </w:p>
+    <w:p>
+      <w:pPr>
+        <w:pStyle w:val="Heading2"/>
+      </w:pPr>
+      <w:r>
+        <w:t>3. ESG-Driven Regeneration &amp; Business Strategy for Let’s Run Park Seoul</w:t>
       </w:r>
     </w:p>
     <w:p>
@@ -292,7 +434,7 @@
         <w:pStyle w:val="Heading2"/>
       </w:pPr>
       <w:r>
-        <w:t>2. World Youth Day 2027: "Global Youth Seoul Living Lab" &amp; UGC Reporter Program</w:t>
+        <w:t>4. World Youth Day 2027: "Global Youth Seoul Living Lab" &amp; UGC Reporter Program</w:t>
       </w:r>
     </w:p>
     <w:p>
@@ -355,7 +497,7 @@
         <w:pStyle w:val="Heading2"/>
       </w:pPr>
       <w:r>
-        <w:t>3. Strategic Business Analysis: Amazon Shopper Panel &amp; Ad Attribution</w:t>
+        <w:t>5. Strategic Business Analysis: Amazon Shopper Panel &amp; Ad Attribution</w:t>
       </w:r>
     </w:p>
     <w:p>
@@ -418,7 +560,7 @@
         <w:pStyle w:val="Heading2"/>
       </w:pPr>
       <w:r>
-        <w:t>4. Market Evolution &amp; Strategic Analysis of the Food Delivery Industry</w:t>
+        <w:t>6. Market Evolution &amp; Strategic Analysis of the Food Delivery Industry</w:t>
       </w:r>
     </w:p>
     <w:p>
@@ -497,7 +639,7 @@
         <w:pStyle w:val="Heading2"/>
       </w:pPr>
       <w:r>
-        <w:t>5. Nielsen PRIZM: Geodemographic Modeling &amp; Hospitality Application</w:t>
+        <w:t>7. Nielsen PRIZM: Geodemographic Modeling &amp; Hospitality Application</w:t>
       </w:r>
     </w:p>
     <w:p>
@@ -560,7 +702,7 @@
         <w:pStyle w:val="Heading2"/>
       </w:pPr>
       <w:r>
-        <w:t>6. AI-Powered Emotion-Based Stayover Tourism Cluster: Chung-Buk</w:t>
+        <w:t>8. AI-Powered Emotion-Based Stayover Tourism Cluster: Chung-Buk</w:t>
       </w:r>
     </w:p>
     <w:p>
@@ -623,7 +765,7 @@
         <w:pStyle w:val="Heading2"/>
       </w:pPr>
       <w:r>
-        <w:t>7. Aman Group: Global Brand Strategy &amp; Industry Benchmarking</w:t>
+        <w:t>9. Aman Group: Global Brand Strategy &amp; Industry Benchmarking</w:t>
       </w:r>
     </w:p>
     <w:p>
@@ -686,7 +828,7 @@
         <w:pStyle w:val="Heading2"/>
       </w:pPr>
       <w:r>
-        <w:t>8. Organizational Behavior &amp; Leadership Frameworks at Marriott</w:t>
+        <w:t>10. Organizational Behavior &amp; Leadership Frameworks at Marriott</w:t>
       </w:r>
     </w:p>
     <w:p>
@@ -749,7 +891,7 @@
         <w:pStyle w:val="Heading2"/>
       </w:pPr>
       <w:r>
-        <w:t>9. Strategic Leadership &amp; Luxury Heritage Transformation: Chaumet (LVMH Group)</w:t>
+        <w:t>11. Strategic Leadership &amp; Luxury Heritage Transformation: Chaumet (LVMH Group)</w:t>
       </w:r>
     </w:p>
     <w:p>

</xml_diff>